<commit_message>
Lean Persian main to rubric; add pre-submission enquiry email
- Moved ALL 10 figures into supplementary_isfahan (main -> 24 pp), with a
  pointer note in the main text. No figure or result lost; figure numbers
  preserved so in-text references still resolve. (Net page saving is small:
  the body text + reference list, not the figures, are the bulk.)
- Re-rendered manuscript_isfahan.{docx,pdf} (24 pp) and
  supplementary_isfahan.{docx,pdf} (10 figures, 2 pp).
- Added contact_email_isfahan.md: a Persian pre-submission enquiry to the
  Isfahan editorial office (lrq@res.ui.ac.ir) asking whether the 20-page
  descriptive-article limit counts the reference list and figure supplement
  or only the main text. (Also staged as a Gmail draft for review.)

English/Religions unchanged: MDPI has no page limit and submission is via the
online portal, so no pre-submission contact is needed.

Co-Authored-By: Claude Opus 4.8 (1M context) <noreply@anthropic.com>
</commit_message>
<xml_diff>
--- a/paper/persian/manuscript_isfahan.docx
+++ b/paper/persian/manuscript_isfahan.docx
@@ -2,7 +2,7 @@
 <file path=word/document.xml><?xml version="1.0" encoding="utf-8"?>
 <w:document xmlns:w="http://schemas.openxmlformats.org/wordprocessingml/2006/main" xmlns:m="http://schemas.openxmlformats.org/officeDocument/2006/math" xmlns:r="http://schemas.openxmlformats.org/officeDocument/2006/relationships" xmlns:o="urn:schemas-microsoft-com:office:office" xmlns:v="urn:schemas-microsoft-com:vml" xmlns:w10="urn:schemas-microsoft-com:office:word" xmlns:a="http://schemas.openxmlformats.org/drawingml/2006/main" xmlns:pic="http://schemas.openxmlformats.org/drawingml/2006/picture" xmlns:wp="http://schemas.openxmlformats.org/drawingml/2006/wordprocessingDrawing">
   <w:body>
-    <w:bookmarkStart w:id="66" w:name="X0edd6e9440fd10700f765d649a6754694cd8705"/>
+    <w:bookmarkStart w:id="48" w:name="X0edd6e9440fd10700f765d649a6754694cd8705"/>
     <w:p>
       <w:pPr>
         <w:pStyle w:val="Heading1"/>
@@ -15032,7 +15032,7 @@
     </w:p>
     <w:bookmarkEnd w:id="45"/>
     <w:bookmarkEnd w:id="46"/>
-    <w:bookmarkStart w:id="65" w:name="پیوست-شکلها"/>
+    <w:bookmarkStart w:id="47" w:name="شکلها"/>
     <w:p>
       <w:pPr>
         <w:pStyle w:val="Heading2"/>
@@ -15044,7 +15044,7 @@
           <w:rtl/>
           <w:lang w:val="fa"/>
         </w:rPr>
-        <w:t xml:space="preserve">پیوست: شکل‌ها</w:t>
+        <w:t xml:space="preserve">شکل‌ها</w:t>
       </w:r>
     </w:p>
     <w:p>
@@ -15058,13 +15058,27 @@
           <w:rtl/>
           <w:lang w:val="fa"/>
         </w:rPr>
-        <w:t xml:space="preserve">برای پرهیز از ازدحامِ متن، همه‌ی شکل‌های مقاله در این پیوست گرد آمده‌اند؛ ارجاع‌های درون‌متنی (مانندِ «نک. شکلِ ۱») به همین شکل‌ها اشاره دارند.</w:t>
-      </w:r>
-    </w:p>
-    <w:p>
-      <w:pPr>
-        <w:pStyle w:val="BlockText"/>
-        <w:bidi/>
+        <w:t xml:space="preserve">همه‌ی شکل‌های مقاله (شکل‌های ۱ تا ۱۰) برای فشرده‌سازیِ متن در «پرونده‌ی تکمیلیِ الکترونیکی» (پرونده‌ی supplementary) ارائه شده‌اند؛ ارجاع‌های درون‌متنیِ «نک. شکلِ N» به همان پرونده اشاره دارند.</w:t>
+      </w:r>
+    </w:p>
+    <w:p>
+      <w:pPr>
+        <w:bidi/>
+        <w:jc w:val="both"/>
+      </w:pPr>
+      <w:r>
+        <w:rPr>
+          <w:rFonts w:ascii="Times New Roman" w:hAnsi="Times New Roman" w:cs="B Lotus"/>
+          <w:rtl/>
+          <w:lang w:val="fa"/>
+        </w:rPr>
+        <w:t xml:space="preserve">{ A Re-reading of ġaḍab, ġayẓ, baġy, ṭuġyān, and ʿutuww in Light of Shīʿī–Sunnī Tafsīr and the Iranian-Islamic Cognitive-Semantic Heritage}</w:t>
+      </w:r>
+    </w:p>
+    <w:p>
+      <w:pPr>
+        <w:bidi/>
+        <w:jc w:val="both"/>
       </w:pPr>
       <w:r>
         <w:rPr>
@@ -15074,80 +15088,29 @@
           <w:rtl/>
           <w:lang w:val="fa"/>
         </w:rPr>
-        <w:t xml:space="preserve">توجه:</w:t>
-      </w:r>
-      <w:r>
-        <w:rPr>
-          <w:rFonts w:ascii="Times New Roman" w:hAnsi="Times New Roman" w:cs="B Lotus"/>
-          <w:rtl/>
-          <w:lang w:val="fa"/>
-        </w:rPr>
-        <w:t xml:space="preserve"> </w:t>
-      </w:r>
-      <w:r>
-        <w:rPr>
-          <w:rFonts w:ascii="Times New Roman" w:hAnsi="Times New Roman" w:cs="B Lotus"/>
-          <w:rtl/>
-          <w:lang w:val="fa"/>
-        </w:rPr>
-        <w:t xml:space="preserve">شکل‌های ۲، ۶، ۷ و ۹ (به‌ترتیب: شجره‌ی نظری، پروفایلِ ریخت‌شناختی، مرکزیتِ شبکه‌ای، و شبکه‌ی هم‌رخدادگیری) برای فشرده‌سازیِ متن، در «پرونده‌ی تکمیلیِ الکترونیکی» ارائه شده‌اند؛ ارجاع‌های درون‌متنیِ آن‌ها به همان پرونده اشاره دارند.</w:t>
-      </w:r>
-    </w:p>
-    <w:p>
-      <w:pPr>
-        <w:pStyle w:val="CaptionedFigure"/>
-        <w:bidi/>
-      </w:pPr>
-      <w:r>
-        <w:rPr>
-          <w:rFonts w:ascii="Times New Roman" w:hAnsi="Times New Roman" w:cs="B Lotus"/>
-        </w:rPr>
-        <w:drawing>
-          <wp:inline>
-            <wp:extent cx="3292602" cy="1286172"/>
-            <wp:effectExtent b="0" l="0" r="0" t="0"/>
-            <wp:docPr descr="شکلِ ۱. پیوستارِ شش‌مرحله‌ایِ طیفِ خشم بر محورِ شدتِ کنش؛ سطحِ هر گره با بسامدِ ریشه متناسب است (پیکره‌ی دوکس، ۲۰۱۱). تحلیلِ مرحله‌ای در بندِ ۵-۲ تا ۵-۶." title="" id="48" name="Picture"/>
-            <a:graphic>
-              <a:graphicData uri="http://schemas.openxmlformats.org/drawingml/2006/picture">
-                <pic:pic>
-                  <pic:nvPicPr>
-                    <pic:cNvPr descr="fig1_continuum.png" id="49" name="Picture"/>
-                    <pic:cNvPicPr>
-                      <a:picLocks noChangeArrowheads="1" noChangeAspect="1"/>
-                    </pic:cNvPicPr>
-                  </pic:nvPicPr>
-                  <pic:blipFill>
-                    <a:blip r:embed="rId47"/>
-                    <a:stretch>
-                      <a:fillRect/>
-                    </a:stretch>
-                  </pic:blipFill>
-                  <pic:spPr bwMode="auto">
-                    <a:xfrm>
-                      <a:off x="0" y="0"/>
-                      <a:ext cx="3292602" cy="1286172"/>
-                    </a:xfrm>
-                    <a:prstGeom prst="rect">
-                      <a:avLst/>
-                    </a:prstGeom>
-                    <a:noFill/>
-                    <a:ln w="9525">
-                      <a:noFill/>
-                      <a:headEnd/>
-                      <a:tailEnd/>
-                    </a:ln>
-                  </pic:spPr>
-                </pic:pic>
-              </a:graphicData>
-            </a:graphic>
-          </wp:inline>
-        </w:drawing>
-      </w:r>
-    </w:p>
-    <w:p>
-      <w:pPr>
-        <w:pStyle w:val="ImageCaption"/>
-        <w:bidi/>
+        <w:t xml:space="preserve">Karim Jabbary</w:t>
+      </w:r>
+      <w:r>
+        <w:rPr>
+          <w:rFonts w:ascii="Times New Roman" w:hAnsi="Times New Roman" w:cs="B Lotus"/>
+          <w:rtl/>
+          <w:lang w:val="fa"/>
+        </w:rPr>
+        <w:t xml:space="preserve"> </w:t>
+      </w:r>
+      <w:r>
+        <w:rPr>
+          <w:rFonts w:ascii="Times New Roman" w:hAnsi="Times New Roman" w:cs="B Lotus"/>
+          <w:rtl/>
+          <w:lang w:val="fa"/>
+        </w:rPr>
+        <w:t xml:space="preserve">(Corresponding author) — Department of Arabic Language and Literature, Faculty of Letters and Humanities, Urmia University, Urmia, Iran. Email: k.jabbary@urmia.ac.ir.</w:t>
+      </w:r>
+    </w:p>
+    <w:p>
+      <w:pPr>
+        <w:bidi/>
+        <w:jc w:val="both"/>
       </w:pPr>
       <w:r>
         <w:rPr>
@@ -15157,31 +15120,55 @@
           <w:rtl/>
           <w:lang w:val="fa"/>
         </w:rPr>
-        <w:t xml:space="preserve">شکلِ ۱.</w:t>
-      </w:r>
-      <w:r>
-        <w:rPr>
-          <w:rFonts w:ascii="Times New Roman" w:hAnsi="Times New Roman" w:cs="B Lotus"/>
-          <w:rtl/>
-          <w:lang w:val="fa"/>
-        </w:rPr>
-        <w:t xml:space="preserve"> </w:t>
-      </w:r>
-      <w:r>
-        <w:rPr>
-          <w:rFonts w:ascii="Times New Roman" w:hAnsi="Times New Roman" w:cs="B Lotus"/>
-          <w:rtl/>
-          <w:lang w:val="fa"/>
-        </w:rPr>
-        <w:t xml:space="preserve">پیوستارِ شش‌مرحله‌ایِ طیفِ خشم بر محورِ</w:t>
-      </w:r>
-      <w:r>
-        <w:rPr>
-          <w:rFonts w:ascii="Times New Roman" w:hAnsi="Times New Roman" w:cs="B Lotus"/>
-          <w:rtl/>
-          <w:lang w:val="fa"/>
-        </w:rPr>
-        <w:t xml:space="preserve"> </w:t>
+        <w:t xml:space="preserve">Ali Jabbary</w:t>
+      </w:r>
+      <w:r>
+        <w:rPr>
+          <w:rFonts w:ascii="Times New Roman" w:hAnsi="Times New Roman" w:cs="B Lotus"/>
+          <w:rtl/>
+          <w:lang w:val="fa"/>
+        </w:rPr>
+        <w:t xml:space="preserve"> </w:t>
+      </w:r>
+      <w:r>
+        <w:rPr>
+          <w:rFonts w:ascii="Times New Roman" w:hAnsi="Times New Roman" w:cs="B Lotus"/>
+          <w:rtl/>
+          <w:lang w:val="fa"/>
+        </w:rPr>
+        <w:t xml:space="preserve">— Department of Mechanical Engineering, Faculty of Engineering, Urmia University, Urmia, Iran. Email: st_a.jabbary@urmia.ac.ir. ORCID: 0000-0003-0573-6909.</w:t>
+      </w:r>
+    </w:p>
+    <w:p>
+      <w:pPr>
+        <w:bidi/>
+        <w:jc w:val="both"/>
+      </w:pPr>
+      <w:r>
+        <w:rPr>
+          <w:rFonts w:ascii="Times New Roman" w:hAnsi="Times New Roman" w:cs="B Lotus"/>
+          <w:b/>
+          <w:bCs/>
+          <w:rtl/>
+          <w:lang w:val="fa"/>
+        </w:rPr>
+        <w:t xml:space="preserve">Abstract.</w:t>
+      </w:r>
+      <w:r>
+        <w:rPr>
+          <w:rFonts w:ascii="Times New Roman" w:hAnsi="Times New Roman" w:cs="B Lotus"/>
+          <w:rtl/>
+          <w:lang w:val="fa"/>
+        </w:rPr>
+        <w:t xml:space="preserve"> </w:t>
+      </w:r>
+      <w:r>
+        <w:rPr>
+          <w:rFonts w:ascii="Times New Roman" w:hAnsi="Times New Roman" w:cs="B Lotus"/>
+          <w:rtl/>
+          <w:lang w:val="fa"/>
+        </w:rPr>
+        <w:t xml:space="preserve">The Holy Qur’ān draws on a precise lexical network — governed not by synonymy but by systematic intensification — to describe the apex of human anger across three final stages: active anger (</w:t>
       </w:r>
       <w:r>
         <w:rPr>
@@ -15191,72 +15178,323 @@
           <w:rtl/>
           <w:lang w:val="fa"/>
         </w:rPr>
-        <w:t xml:space="preserve">شدتِ کنش</w:t>
-      </w:r>
-      <w:r>
-        <w:rPr>
-          <w:rFonts w:ascii="Times New Roman" w:hAnsi="Times New Roman" w:cs="B Lotus"/>
-          <w:rtl/>
-          <w:lang w:val="fa"/>
-        </w:rPr>
-        <w:t xml:space="preserve">؛ سطحِ هر گره با بسامدِ ریشه متناسب است (پیکره‌ی دوکس، ۲۰۱۱). تحلیلِ مرحله‌ای در بندِ ۵-۲ تا ۵-۶.</w:t>
-      </w:r>
-    </w:p>
-    <w:p>
-      <w:pPr>
-        <w:pStyle w:val="CaptionedFigure"/>
-        <w:bidi/>
-      </w:pPr>
-      <w:r>
-        <w:rPr>
-          <w:rFonts w:ascii="Times New Roman" w:hAnsi="Times New Roman" w:cs="B Lotus"/>
-        </w:rPr>
-        <w:drawing>
-          <wp:inline>
-            <wp:extent cx="3292602" cy="2257784"/>
-            <wp:effectExtent b="0" l="0" r="0" t="0"/>
-            <wp:docPr descr="شکلِ ۳. نقشه‌ی تطبیقیِ نُه مفسّر بر سه‌گانه‌ی غضب-غیظ-بَغی؛ هم‌گرایی‌ها و واگرایی‌های بین‌سنّتی در دو جعبه‌ی پایین (تفصیل در بندِ ۵-۴ تا ۵-۶)." title="" id="51" name="Picture"/>
-            <a:graphic>
-              <a:graphicData uri="http://schemas.openxmlformats.org/drawingml/2006/picture">
-                <pic:pic>
-                  <pic:nvPicPr>
-                    <pic:cNvPr descr="fig8_mufassir.png" id="52" name="Picture"/>
-                    <pic:cNvPicPr>
-                      <a:picLocks noChangeArrowheads="1" noChangeAspect="1"/>
-                    </pic:cNvPicPr>
-                  </pic:nvPicPr>
-                  <pic:blipFill>
-                    <a:blip r:embed="rId50"/>
-                    <a:stretch>
-                      <a:fillRect/>
-                    </a:stretch>
-                  </pic:blipFill>
-                  <pic:spPr bwMode="auto">
-                    <a:xfrm>
-                      <a:off x="0" y="0"/>
-                      <a:ext cx="3292602" cy="2257784"/>
-                    </a:xfrm>
-                    <a:prstGeom prst="rect">
-                      <a:avLst/>
-                    </a:prstGeom>
-                    <a:noFill/>
-                    <a:ln w="9525">
-                      <a:noFill/>
-                      <a:headEnd/>
-                      <a:tailEnd/>
-                    </a:ln>
-                  </pic:spPr>
-                </pic:pic>
-              </a:graphicData>
-            </a:graphic>
-          </wp:inline>
-        </w:drawing>
-      </w:r>
-    </w:p>
-    <w:p>
-      <w:pPr>
-        <w:pStyle w:val="ImageCaption"/>
-        <w:bidi/>
+        <w:t xml:space="preserve">ġaḍab</w:t>
+      </w:r>
+      <w:r>
+        <w:rPr>
+          <w:rFonts w:ascii="Times New Roman" w:hAnsi="Times New Roman" w:cs="B Lotus"/>
+          <w:rtl/>
+          <w:lang w:val="fa"/>
+        </w:rPr>
+        <w:t xml:space="preserve">,</w:t>
+      </w:r>
+      <w:r>
+        <w:rPr>
+          <w:rFonts w:ascii="Times New Roman" w:hAnsi="Times New Roman" w:cs="B Lotus"/>
+          <w:rtl/>
+          <w:lang w:val="fa"/>
+        </w:rPr>
+        <w:t xml:space="preserve"> </w:t>
+      </w:r>
+      <w:r>
+        <w:rPr>
+          <w:rFonts w:ascii="Times New Roman" w:hAnsi="Times New Roman" w:cs="B Lotus"/>
+          <w:i/>
+          <w:iCs/>
+          <w:rtl/>
+          <w:lang w:val="fa"/>
+        </w:rPr>
+        <w:t xml:space="preserve">ḥarad</w:t>
+      </w:r>
+      <w:r>
+        <w:rPr>
+          <w:rFonts w:ascii="Times New Roman" w:hAnsi="Times New Roman" w:cs="B Lotus"/>
+          <w:rtl/>
+          <w:lang w:val="fa"/>
+        </w:rPr>
+        <w:t xml:space="preserve">); compressed anger that nears container collapse (</w:t>
+      </w:r>
+      <w:r>
+        <w:rPr>
+          <w:rFonts w:ascii="Times New Roman" w:hAnsi="Times New Roman" w:cs="B Lotus"/>
+          <w:i/>
+          <w:iCs/>
+          <w:rtl/>
+          <w:lang w:val="fa"/>
+        </w:rPr>
+        <w:t xml:space="preserve">ġayẓ</w:t>
+      </w:r>
+      <w:r>
+        <w:rPr>
+          <w:rFonts w:ascii="Times New Roman" w:hAnsi="Times New Roman" w:cs="B Lotus"/>
+          <w:rtl/>
+          <w:lang w:val="fa"/>
+        </w:rPr>
+        <w:t xml:space="preserve">, manifested as</w:t>
+      </w:r>
+      <w:r>
+        <w:rPr>
+          <w:rFonts w:ascii="Times New Roman" w:hAnsi="Times New Roman" w:cs="B Lotus"/>
+          <w:rtl/>
+          <w:lang w:val="fa"/>
+        </w:rPr>
+        <w:t xml:space="preserve"> </w:t>
+      </w:r>
+      <w:r>
+        <w:rPr>
+          <w:rFonts w:ascii="Times New Roman" w:hAnsi="Times New Roman" w:cs="B Lotus"/>
+          <w:i/>
+          <w:iCs/>
+          <w:rtl/>
+          <w:lang w:val="fa"/>
+        </w:rPr>
+        <w:t xml:space="preserve">tamayyuz</w:t>
+      </w:r>
+      <w:r>
+        <w:rPr>
+          <w:rFonts w:ascii="Times New Roman" w:hAnsi="Times New Roman" w:cs="B Lotus"/>
+          <w:rtl/>
+          <w:lang w:val="fa"/>
+        </w:rPr>
+        <w:t xml:space="preserve">); and its behavioural consequences (</w:t>
+      </w:r>
+      <w:r>
+        <w:rPr>
+          <w:rFonts w:ascii="Times New Roman" w:hAnsi="Times New Roman" w:cs="B Lotus"/>
+          <w:i/>
+          <w:iCs/>
+          <w:rtl/>
+          <w:lang w:val="fa"/>
+        </w:rPr>
+        <w:t xml:space="preserve">baġy</w:t>
+      </w:r>
+      <w:r>
+        <w:rPr>
+          <w:rFonts w:ascii="Times New Roman" w:hAnsi="Times New Roman" w:cs="B Lotus"/>
+          <w:rtl/>
+          <w:lang w:val="fa"/>
+        </w:rPr>
+        <w:t xml:space="preserve">,</w:t>
+      </w:r>
+      <w:r>
+        <w:rPr>
+          <w:rFonts w:ascii="Times New Roman" w:hAnsi="Times New Roman" w:cs="B Lotus"/>
+          <w:rtl/>
+          <w:lang w:val="fa"/>
+        </w:rPr>
+        <w:t xml:space="preserve"> </w:t>
+      </w:r>
+      <w:r>
+        <w:rPr>
+          <w:rFonts w:ascii="Times New Roman" w:hAnsi="Times New Roman" w:cs="B Lotus"/>
+          <w:i/>
+          <w:iCs/>
+          <w:rtl/>
+          <w:lang w:val="fa"/>
+        </w:rPr>
+        <w:t xml:space="preserve">ṭuġyān</w:t>
+      </w:r>
+      <w:r>
+        <w:rPr>
+          <w:rFonts w:ascii="Times New Roman" w:hAnsi="Times New Roman" w:cs="B Lotus"/>
+          <w:rtl/>
+          <w:lang w:val="fa"/>
+        </w:rPr>
+        <w:t xml:space="preserve">,</w:t>
+      </w:r>
+      <w:r>
+        <w:rPr>
+          <w:rFonts w:ascii="Times New Roman" w:hAnsi="Times New Roman" w:cs="B Lotus"/>
+          <w:rtl/>
+          <w:lang w:val="fa"/>
+        </w:rPr>
+        <w:t xml:space="preserve"> </w:t>
+      </w:r>
+      <w:r>
+        <w:rPr>
+          <w:rFonts w:ascii="Times New Roman" w:hAnsi="Times New Roman" w:cs="B Lotus"/>
+          <w:i/>
+          <w:iCs/>
+          <w:rtl/>
+          <w:lang w:val="fa"/>
+        </w:rPr>
+        <w:t xml:space="preserve">ʿutuww</w:t>
+      </w:r>
+      <w:r>
+        <w:rPr>
+          <w:rFonts w:ascii="Times New Roman" w:hAnsi="Times New Roman" w:cs="B Lotus"/>
+          <w:rtl/>
+          <w:lang w:val="fa"/>
+        </w:rPr>
+        <w:t xml:space="preserve">). Adopting a comparative-analytical method, this study integrates Izutsu’s field semantics with Conceptual Metaphor Theory and re-reads nine canonical Shīʿī and Sunnī mufassirs against the Quranic Arabic Corpus (Dukes, 2011; 312 attestations across fourteen focal roots, with analytic focus on 181 attestations of Stages 4–6). Three principal findings emerge. First, a robust Shīʿī–Sunnī convergence on the triad</w:t>
+      </w:r>
+      <w:r>
+        <w:rPr>
+          <w:rFonts w:ascii="Times New Roman" w:hAnsi="Times New Roman" w:cs="B Lotus"/>
+          <w:rtl/>
+          <w:lang w:val="fa"/>
+        </w:rPr>
+        <w:t xml:space="preserve"> </w:t>
+      </w:r>
+      <w:r>
+        <w:rPr>
+          <w:rFonts w:ascii="Times New Roman" w:hAnsi="Times New Roman" w:cs="B Lotus"/>
+          <w:i/>
+          <w:iCs/>
+          <w:rtl/>
+          <w:lang w:val="fa"/>
+        </w:rPr>
+        <w:t xml:space="preserve">ġaḍab</w:t>
+      </w:r>
+      <w:r>
+        <w:rPr>
+          <w:rFonts w:ascii="Times New Roman" w:hAnsi="Times New Roman" w:cs="B Lotus"/>
+          <w:rtl/>
+          <w:lang w:val="fa"/>
+        </w:rPr>
+        <w:t xml:space="preserve"> </w:t>
+      </w:r>
+      <w:r>
+        <w:rPr>
+          <w:rFonts w:ascii="Times New Roman" w:hAnsi="Times New Roman" w:cs="B Lotus"/>
+          <w:rtl/>
+          <w:lang w:val="fa"/>
+        </w:rPr>
+        <w:t xml:space="preserve">→ compressed</w:t>
+      </w:r>
+      <w:r>
+        <w:rPr>
+          <w:rFonts w:ascii="Times New Roman" w:hAnsi="Times New Roman" w:cs="B Lotus"/>
+          <w:rtl/>
+          <w:lang w:val="fa"/>
+        </w:rPr>
+        <w:t xml:space="preserve"> </w:t>
+      </w:r>
+      <w:r>
+        <w:rPr>
+          <w:rFonts w:ascii="Times New Roman" w:hAnsi="Times New Roman" w:cs="B Lotus"/>
+          <w:i/>
+          <w:iCs/>
+          <w:rtl/>
+          <w:lang w:val="fa"/>
+        </w:rPr>
+        <w:t xml:space="preserve">ġayẓ</w:t>
+      </w:r>
+      <w:r>
+        <w:rPr>
+          <w:rFonts w:ascii="Times New Roman" w:hAnsi="Times New Roman" w:cs="B Lotus"/>
+          <w:rtl/>
+          <w:lang w:val="fa"/>
+        </w:rPr>
+        <w:t xml:space="preserve"> </w:t>
+      </w:r>
+      <w:r>
+        <w:rPr>
+          <w:rFonts w:ascii="Times New Roman" w:hAnsi="Times New Roman" w:cs="B Lotus"/>
+          <w:rtl/>
+          <w:lang w:val="fa"/>
+        </w:rPr>
+        <w:t xml:space="preserve">→ container collapse coherently operationalises the four canonical steps of the</w:t>
+      </w:r>
+      <w:r>
+        <w:rPr>
+          <w:rFonts w:ascii="Times New Roman" w:hAnsi="Times New Roman" w:cs="B Lotus"/>
+          <w:rtl/>
+          <w:lang w:val="fa"/>
+        </w:rPr>
+        <w:t xml:space="preserve"> </w:t>
+      </w:r>
+      <w:r>
+        <w:rPr>
+          <w:rFonts w:ascii="Times New Roman" w:hAnsi="Times New Roman" w:cs="B Lotus"/>
+          <w:i/>
+          <w:iCs/>
+          <w:rtl/>
+          <w:lang w:val="fa"/>
+        </w:rPr>
+        <w:t xml:space="preserve">anger as a pressurised container</w:t>
+      </w:r>
+      <w:r>
+        <w:rPr>
+          <w:rFonts w:ascii="Times New Roman" w:hAnsi="Times New Roman" w:cs="B Lotus"/>
+          <w:rtl/>
+          <w:lang w:val="fa"/>
+        </w:rPr>
+        <w:t xml:space="preserve"> </w:t>
+      </w:r>
+      <w:r>
+        <w:rPr>
+          <w:rFonts w:ascii="Times New Roman" w:hAnsi="Times New Roman" w:cs="B Lotus"/>
+          <w:rtl/>
+          <w:lang w:val="fa"/>
+        </w:rPr>
+        <w:t xml:space="preserve">metaphor. Second, a striking correspondence holds between al-Mīzān’s classical definition of</w:t>
+      </w:r>
+      <w:r>
+        <w:rPr>
+          <w:rFonts w:ascii="Times New Roman" w:hAnsi="Times New Roman" w:cs="B Lotus"/>
+          <w:rtl/>
+          <w:lang w:val="fa"/>
+        </w:rPr>
+        <w:t xml:space="preserve"> </w:t>
+      </w:r>
+      <w:r>
+        <w:rPr>
+          <w:rFonts w:ascii="Times New Roman" w:hAnsi="Times New Roman" w:cs="B Lotus"/>
+          <w:i/>
+          <w:iCs/>
+          <w:rtl/>
+          <w:lang w:val="fa"/>
+        </w:rPr>
+        <w:t xml:space="preserve">kaẓm</w:t>
+      </w:r>
+      <w:r>
+        <w:rPr>
+          <w:rFonts w:ascii="Times New Roman" w:hAnsi="Times New Roman" w:cs="B Lotus"/>
+          <w:rtl/>
+          <w:lang w:val="fa"/>
+        </w:rPr>
+        <w:t xml:space="preserve"> </w:t>
+      </w:r>
+      <w:r>
+        <w:rPr>
+          <w:rFonts w:ascii="Times New Roman" w:hAnsi="Times New Roman" w:cs="B Lotus"/>
+          <w:rtl/>
+          <w:lang w:val="fa"/>
+        </w:rPr>
+        <w:t xml:space="preserve">and the contemporary suppression-and-reappraisal construct of the process model of emotion regulation. Third, exegesis-grounded coding of all 145 Stage-6 attestations (with second-coder verification on a 20% sample, Cohen’s κ = 0.79) shows that Stage-6 consequences are predominantly structurally originated rather than symmetrically bidirectional: only 26% are anger-originated, 49% are structurally originated (greed, arrogance,</w:t>
+      </w:r>
+      <w:r>
+        <w:rPr>
+          <w:rFonts w:ascii="Times New Roman" w:hAnsi="Times New Roman" w:cs="B Lotus"/>
+          <w:rtl/>
+          <w:lang w:val="fa"/>
+        </w:rPr>
+        <w:t xml:space="preserve"> </w:t>
+      </w:r>
+      <w:r>
+        <w:rPr>
+          <w:rFonts w:ascii="Times New Roman" w:hAnsi="Times New Roman" w:cs="B Lotus"/>
+          <w:i/>
+          <w:iCs/>
+          <w:rtl/>
+          <w:lang w:val="fa"/>
+        </w:rPr>
+        <w:t xml:space="preserve">ʿuluww fī al-arḍ</w:t>
+      </w:r>
+      <w:r>
+        <w:rPr>
+          <w:rFonts w:ascii="Times New Roman" w:hAnsi="Times New Roman" w:cs="B Lotus"/>
+          <w:rtl/>
+          <w:lang w:val="fa"/>
+        </w:rPr>
+        <w:t xml:space="preserve">), and 25% admit both readings, with a documented case-wise reversal of causal polarity (sūrat al-Shuʿarāʾ: 55). The study’s novelty is not the mere restatement of an exegetical intuition but its conversion into a measurable object: a rank-ordered six-stage geometry and a quantified 4.4:1 phenomenological-to-consequential ratio that single-verse exegesis does not surface. The proposed intensity ordering rests on lexical-exegetical argument, not on distributional statistics, which evidence only discursive specialisation.</w:t>
+      </w:r>
+    </w:p>
+    <w:p>
+      <w:pPr>
+        <w:bidi/>
+        <w:jc w:val="both"/>
       </w:pPr>
       <w:r>
         <w:rPr>
@@ -15266,106 +15504,23 @@
           <w:rtl/>
           <w:lang w:val="fa"/>
         </w:rPr>
-        <w:t xml:space="preserve">شکلِ ۳.</w:t>
-      </w:r>
-      <w:r>
-        <w:rPr>
-          <w:rFonts w:ascii="Times New Roman" w:hAnsi="Times New Roman" w:cs="B Lotus"/>
-          <w:rtl/>
-          <w:lang w:val="fa"/>
-        </w:rPr>
-        <w:t xml:space="preserve"> </w:t>
-      </w:r>
-      <w:r>
-        <w:rPr>
-          <w:rFonts w:ascii="Times New Roman" w:hAnsi="Times New Roman" w:cs="B Lotus"/>
-          <w:rtl/>
-          <w:lang w:val="fa"/>
-        </w:rPr>
-        <w:t xml:space="preserve">نقشه‌ی تطبیقیِ نُه مفسّر بر سه‌گانه‌ی غضب-غیظ-بَغی؛ هم‌گرایی‌ها و واگرایی‌های بین‌سنّتی در دو جعبه‌ی پایین (تفصیل در بندِ ۵-۴ تا ۵-۶).</w:t>
-      </w:r>
-    </w:p>
-    <w:p>
-      <w:pPr>
-        <w:pStyle w:val="CaptionedFigure"/>
-        <w:bidi/>
-      </w:pPr>
-      <w:r>
-        <w:rPr>
-          <w:rFonts w:ascii="Times New Roman" w:hAnsi="Times New Roman" w:cs="B Lotus"/>
-        </w:rPr>
-        <w:drawing>
-          <wp:inline>
-            <wp:extent cx="3292602" cy="1240439"/>
-            <wp:effectExtent b="0" l="0" r="0" t="0"/>
-            <wp:docPr descr="شکلِ ۴. بسامدِ ۳۱۲ موردِ کانونیِ طیف. پنلِ راست: بسامد به‌تفکیکِ ریشه (رنگِ میله = کدِ مرحله). پنلِ چپ: مجموعِ هر مرحله. آزمونِ خی-دوی مرحله‌ای، شاهدِ تمرکزِ گفتمانی (نه ساختارِ مرتبه‌ایِ شدت) است: \chi^2(5) = 227.15، p &lt; 0.001 (مجانبی) / p = 0.24 (جایگشتی، مقدارِ قابلِ‌اعتماد)." title="" id="54" name="Picture"/>
-            <a:graphic>
-              <a:graphicData uri="http://schemas.openxmlformats.org/drawingml/2006/picture">
-                <pic:pic>
-                  <pic:nvPicPr>
-                    <pic:cNvPr descr="fig2_frequency_by_stage.png" id="55" name="Picture"/>
-                    <pic:cNvPicPr>
-                      <a:picLocks noChangeArrowheads="1" noChangeAspect="1"/>
-                    </pic:cNvPicPr>
-                  </pic:nvPicPr>
-                  <pic:blipFill>
-                    <a:blip r:embed="rId53"/>
-                    <a:stretch>
-                      <a:fillRect/>
-                    </a:stretch>
-                  </pic:blipFill>
-                  <pic:spPr bwMode="auto">
-                    <a:xfrm>
-                      <a:off x="0" y="0"/>
-                      <a:ext cx="3292602" cy="1240439"/>
-                    </a:xfrm>
-                    <a:prstGeom prst="rect">
-                      <a:avLst/>
-                    </a:prstGeom>
-                    <a:noFill/>
-                    <a:ln w="9525">
-                      <a:noFill/>
-                      <a:headEnd/>
-                      <a:tailEnd/>
-                    </a:ln>
-                  </pic:spPr>
-                </pic:pic>
-              </a:graphicData>
-            </a:graphic>
-          </wp:inline>
-        </w:drawing>
-      </w:r>
-    </w:p>
-    <w:p>
-      <w:pPr>
-        <w:pStyle w:val="ImageCaption"/>
-        <w:bidi/>
-      </w:pPr>
-      <w:r>
-        <w:rPr>
-          <w:rFonts w:ascii="Times New Roman" w:hAnsi="Times New Roman" w:cs="B Lotus"/>
-          <w:b/>
-          <w:bCs/>
-          <w:rtl/>
-          <w:lang w:val="fa"/>
-        </w:rPr>
-        <w:t xml:space="preserve">شکلِ ۴.</w:t>
-      </w:r>
-      <w:r>
-        <w:rPr>
-          <w:rFonts w:ascii="Times New Roman" w:hAnsi="Times New Roman" w:cs="B Lotus"/>
-          <w:rtl/>
-          <w:lang w:val="fa"/>
-        </w:rPr>
-        <w:t xml:space="preserve"> </w:t>
-      </w:r>
-      <w:r>
-        <w:rPr>
-          <w:rFonts w:ascii="Times New Roman" w:hAnsi="Times New Roman" w:cs="B Lotus"/>
-          <w:rtl/>
-          <w:lang w:val="fa"/>
-        </w:rPr>
-        <w:t xml:space="preserve">بسامدِ ۳۱۲ موردِ کانونیِ طیف.</w:t>
+        <w:t xml:space="preserve">Keywords:</w:t>
+      </w:r>
+      <w:r>
+        <w:rPr>
+          <w:rFonts w:ascii="Times New Roman" w:hAnsi="Times New Roman" w:cs="B Lotus"/>
+          <w:rtl/>
+          <w:lang w:val="fa"/>
+        </w:rPr>
+        <w:t xml:space="preserve"> </w:t>
+      </w:r>
+      <w:r>
+        <w:rPr>
+          <w:rFonts w:ascii="Times New Roman" w:hAnsi="Times New Roman" w:cs="B Lotus"/>
+          <w:rtl/>
+          <w:lang w:val="fa"/>
+        </w:rPr>
+        <w:t xml:space="preserve">comparative tafsīr; Qur’ānic anger spectrum; conceptual metaphor;</w:t>
       </w:r>
       <w:r>
         <w:rPr>
@@ -15383,997 +15538,6 @@
           <w:rtl/>
           <w:lang w:val="fa"/>
         </w:rPr>
-        <w:t xml:space="preserve">پنلِ راست</w:t>
-      </w:r>
-      <w:r>
-        <w:rPr>
-          <w:rFonts w:ascii="Times New Roman" w:hAnsi="Times New Roman" w:cs="B Lotus"/>
-          <w:rtl/>
-          <w:lang w:val="fa"/>
-        </w:rPr>
-        <w:t xml:space="preserve">: بسامد به‌تفکیکِ ریشه (رنگِ میله = کدِ مرحله).</w:t>
-      </w:r>
-      <w:r>
-        <w:rPr>
-          <w:rFonts w:ascii="Times New Roman" w:hAnsi="Times New Roman" w:cs="B Lotus"/>
-          <w:rtl/>
-          <w:lang w:val="fa"/>
-        </w:rPr>
-        <w:t xml:space="preserve"> </w:t>
-      </w:r>
-      <w:r>
-        <w:rPr>
-          <w:rFonts w:ascii="Times New Roman" w:hAnsi="Times New Roman" w:cs="B Lotus"/>
-          <w:i/>
-          <w:iCs/>
-          <w:rtl/>
-          <w:lang w:val="fa"/>
-        </w:rPr>
-        <w:t xml:space="preserve">پنلِ چپ</w:t>
-      </w:r>
-      <w:r>
-        <w:rPr>
-          <w:rFonts w:ascii="Times New Roman" w:hAnsi="Times New Roman" w:cs="B Lotus"/>
-          <w:rtl/>
-          <w:lang w:val="fa"/>
-        </w:rPr>
-        <w:t xml:space="preserve">: مجموعِ هر مرحله. آزمونِ خی-دوی مرحله‌ای، شاهدِ</w:t>
-      </w:r>
-      <w:r>
-        <w:rPr>
-          <w:rFonts w:ascii="Times New Roman" w:hAnsi="Times New Roman" w:cs="B Lotus"/>
-          <w:rtl/>
-          <w:lang w:val="fa"/>
-        </w:rPr>
-        <w:t xml:space="preserve"> </w:t>
-      </w:r>
-      <w:r>
-        <w:rPr>
-          <w:rFonts w:ascii="Times New Roman" w:hAnsi="Times New Roman" w:cs="B Lotus"/>
-          <w:i/>
-          <w:iCs/>
-          <w:rtl/>
-          <w:lang w:val="fa"/>
-        </w:rPr>
-        <w:t xml:space="preserve">تمرکزِ گفتمانی</w:t>
-      </w:r>
-      <w:r>
-        <w:rPr>
-          <w:rFonts w:ascii="Times New Roman" w:hAnsi="Times New Roman" w:cs="B Lotus"/>
-          <w:rtl/>
-          <w:lang w:val="fa"/>
-        </w:rPr>
-        <w:t xml:space="preserve"> </w:t>
-      </w:r>
-      <w:r>
-        <w:rPr>
-          <w:rFonts w:ascii="Times New Roman" w:hAnsi="Times New Roman" w:cs="B Lotus"/>
-          <w:rtl/>
-          <w:lang w:val="fa"/>
-        </w:rPr>
-        <w:t xml:space="preserve">(نه ساختارِ مرتبه‌ایِ شدت) است:</w:t>
-      </w:r>
-      <w:r>
-        <w:rPr>
-          <w:rFonts w:ascii="Times New Roman" w:hAnsi="Times New Roman" w:cs="B Lotus"/>
-          <w:rtl/>
-          <w:lang w:val="fa"/>
-        </w:rPr>
-        <w:t xml:space="preserve"> </w:t>
-      </w:r>
-      <m:oMath>
-        <m:sSup>
-          <m:e>
-            <m:r>
-              <m:t>χ</m:t>
-            </m:r>
-          </m:e>
-          <m:sup>
-            <m:r>
-              <m:t>2</m:t>
-            </m:r>
-          </m:sup>
-        </m:sSup>
-        <m:r>
-          <m:rPr>
-            <m:sty m:val="p"/>
-          </m:rPr>
-          <m:t>(</m:t>
-        </m:r>
-        <m:r>
-          <m:t>5</m:t>
-        </m:r>
-        <m:r>
-          <m:rPr>
-            <m:sty m:val="p"/>
-          </m:rPr>
-          <m:t>)</m:t>
-        </m:r>
-        <m:r>
-          <m:rPr>
-            <m:sty m:val="p"/>
-          </m:rPr>
-          <m:t>=</m:t>
-        </m:r>
-        <m:r>
-          <m:t>227.15</m:t>
-        </m:r>
-      </m:oMath>
-      <w:r>
-        <w:rPr>
-          <w:rFonts w:ascii="Times New Roman" w:hAnsi="Times New Roman" w:cs="B Lotus"/>
-          <w:rtl/>
-          <w:lang w:val="fa"/>
-        </w:rPr>
-        <w:t xml:space="preserve">،</w:t>
-      </w:r>
-      <w:r>
-        <w:rPr>
-          <w:rFonts w:ascii="Times New Roman" w:hAnsi="Times New Roman" w:cs="B Lotus"/>
-          <w:rtl/>
-          <w:lang w:val="fa"/>
-        </w:rPr>
-        <w:t xml:space="preserve"> </w:t>
-      </w:r>
-      <m:oMath>
-        <m:r>
-          <m:t>p</m:t>
-        </m:r>
-        <m:r>
-          <m:rPr>
-            <m:sty m:val="p"/>
-          </m:rPr>
-          <m:t>&lt;</m:t>
-        </m:r>
-        <m:r>
-          <m:t>0.001</m:t>
-        </m:r>
-      </m:oMath>
-      <w:r>
-        <w:rPr>
-          <w:rFonts w:ascii="Times New Roman" w:hAnsi="Times New Roman" w:cs="B Lotus"/>
-          <w:rtl/>
-          <w:lang w:val="fa"/>
-        </w:rPr>
-        <w:t xml:space="preserve"> </w:t>
-      </w:r>
-      <w:r>
-        <w:rPr>
-          <w:rFonts w:ascii="Times New Roman" w:hAnsi="Times New Roman" w:cs="B Lotus"/>
-          <w:rtl/>
-          <w:lang w:val="fa"/>
-        </w:rPr>
-        <w:t xml:space="preserve">(مجانبی) /</w:t>
-      </w:r>
-      <w:r>
-        <w:rPr>
-          <w:rFonts w:ascii="Times New Roman" w:hAnsi="Times New Roman" w:cs="B Lotus"/>
-          <w:rtl/>
-          <w:lang w:val="fa"/>
-        </w:rPr>
-        <w:t xml:space="preserve"> </w:t>
-      </w:r>
-      <m:oMath>
-        <m:r>
-          <m:t>p</m:t>
-        </m:r>
-        <m:r>
-          <m:rPr>
-            <m:sty m:val="p"/>
-          </m:rPr>
-          <m:t>=</m:t>
-        </m:r>
-        <m:r>
-          <m:t>0.24</m:t>
-        </m:r>
-      </m:oMath>
-      <w:r>
-        <w:rPr>
-          <w:rFonts w:ascii="Times New Roman" w:hAnsi="Times New Roman" w:cs="B Lotus"/>
-          <w:rtl/>
-          <w:lang w:val="fa"/>
-        </w:rPr>
-        <w:t xml:space="preserve"> </w:t>
-      </w:r>
-      <w:r>
-        <w:rPr>
-          <w:rFonts w:ascii="Times New Roman" w:hAnsi="Times New Roman" w:cs="B Lotus"/>
-          <w:rtl/>
-          <w:lang w:val="fa"/>
-        </w:rPr>
-        <w:t xml:space="preserve">(جایگشتی، مقدارِ قابلِ‌اعتماد).</w:t>
-      </w:r>
-    </w:p>
-    <w:p>
-      <w:pPr>
-        <w:pStyle w:val="CaptionedFigure"/>
-        <w:bidi/>
-      </w:pPr>
-      <w:r>
-        <w:rPr>
-          <w:rFonts w:ascii="Times New Roman" w:hAnsi="Times New Roman" w:cs="B Lotus"/>
-        </w:rPr>
-        <w:drawing>
-          <wp:inline>
-            <wp:extent cx="3292602" cy="1292330"/>
-            <wp:effectExtent b="0" l="0" r="0" t="0"/>
-            <wp:docPr descr="شکلِ ۵. توزیعِ مکّی/مدنیِ ۱۴ ریشه‌ی کانونی (اعداد = نسبتِ خام). ریشه‌های معنادار پس از تصحیحِ هولم: کَره (مدنی-غالب)، سَخَط (انحصاراً مدنی)، بَغی (مدنی)، غیظ (مدنی). نک. جدولِ ۲ برای p خام و p هولم به‌تفکیک." title="" id="57" name="Picture"/>
-            <a:graphic>
-              <a:graphicData uri="http://schemas.openxmlformats.org/drawingml/2006/picture">
-                <pic:pic>
-                  <pic:nvPicPr>
-                    <pic:cNvPr descr="fig3_meccan_medinan.png" id="58" name="Picture"/>
-                    <pic:cNvPicPr>
-                      <a:picLocks noChangeArrowheads="1" noChangeAspect="1"/>
-                    </pic:cNvPicPr>
-                  </pic:nvPicPr>
-                  <pic:blipFill>
-                    <a:blip r:embed="rId56"/>
-                    <a:stretch>
-                      <a:fillRect/>
-                    </a:stretch>
-                  </pic:blipFill>
-                  <pic:spPr bwMode="auto">
-                    <a:xfrm>
-                      <a:off x="0" y="0"/>
-                      <a:ext cx="3292602" cy="1292330"/>
-                    </a:xfrm>
-                    <a:prstGeom prst="rect">
-                      <a:avLst/>
-                    </a:prstGeom>
-                    <a:noFill/>
-                    <a:ln w="9525">
-                      <a:noFill/>
-                      <a:headEnd/>
-                      <a:tailEnd/>
-                    </a:ln>
-                  </pic:spPr>
-                </pic:pic>
-              </a:graphicData>
-            </a:graphic>
-          </wp:inline>
-        </w:drawing>
-      </w:r>
-    </w:p>
-    <w:p>
-      <w:pPr>
-        <w:pStyle w:val="ImageCaption"/>
-        <w:bidi/>
-      </w:pPr>
-      <w:r>
-        <w:rPr>
-          <w:rFonts w:ascii="Times New Roman" w:hAnsi="Times New Roman" w:cs="B Lotus"/>
-          <w:b/>
-          <w:bCs/>
-          <w:rtl/>
-          <w:lang w:val="fa"/>
-        </w:rPr>
-        <w:t xml:space="preserve">شکلِ ۵.</w:t>
-      </w:r>
-      <w:r>
-        <w:rPr>
-          <w:rFonts w:ascii="Times New Roman" w:hAnsi="Times New Roman" w:cs="B Lotus"/>
-          <w:rtl/>
-          <w:lang w:val="fa"/>
-        </w:rPr>
-        <w:t xml:space="preserve"> </w:t>
-      </w:r>
-      <w:r>
-        <w:rPr>
-          <w:rFonts w:ascii="Times New Roman" w:hAnsi="Times New Roman" w:cs="B Lotus"/>
-          <w:rtl/>
-          <w:lang w:val="fa"/>
-        </w:rPr>
-        <w:t xml:space="preserve">توزیعِ مکّی/مدنیِ ۱۴ ریشه‌ی کانونی (اعداد = نسبتِ خام). ریشه‌های معنادار پس از تصحیحِ هولم: کَره (مدنی-غالب)، سَخَط (انحصاراً مدنی)، بَغی (مدنی)، غیظ (مدنی). نک. جدولِ ۲ برای p خام و p هولم به‌تفکیک.</w:t>
-      </w:r>
-    </w:p>
-    <w:p>
-      <w:pPr>
-        <w:pStyle w:val="CaptionedFigure"/>
-        <w:bidi/>
-      </w:pPr>
-      <w:r>
-        <w:rPr>
-          <w:rFonts w:ascii="Times New Roman" w:hAnsi="Times New Roman" w:cs="B Lotus"/>
-        </w:rPr>
-        <w:drawing>
-          <wp:inline>
-            <wp:extent cx="3292602" cy="3385457"/>
-            <wp:effectExtent b="0" l="0" r="0" t="0"/>
-            <wp:docPr descr="شکلِ ۸. عملیاتی‌سازیِ قرآنیِ استعاره‌ی خشم به‌مثابه‌ی ظرفِ تحتِ فشار در مثلثِ غضب ← غیظ+کَظم ← تَمَیُّز (تفصیل در بندِ ۵-۵)." title="" id="60" name="Picture"/>
-            <a:graphic>
-              <a:graphicData uri="http://schemas.openxmlformats.org/drawingml/2006/picture">
-                <pic:pic>
-                  <pic:nvPicPr>
-                    <pic:cNvPr descr="fig6_metaphor_diagram.png" id="61" name="Picture"/>
-                    <pic:cNvPicPr>
-                      <a:picLocks noChangeArrowheads="1" noChangeAspect="1"/>
-                    </pic:cNvPicPr>
-                  </pic:nvPicPr>
-                  <pic:blipFill>
-                    <a:blip r:embed="rId59"/>
-                    <a:stretch>
-                      <a:fillRect/>
-                    </a:stretch>
-                  </pic:blipFill>
-                  <pic:spPr bwMode="auto">
-                    <a:xfrm>
-                      <a:off x="0" y="0"/>
-                      <a:ext cx="3292602" cy="3385457"/>
-                    </a:xfrm>
-                    <a:prstGeom prst="rect">
-                      <a:avLst/>
-                    </a:prstGeom>
-                    <a:noFill/>
-                    <a:ln w="9525">
-                      <a:noFill/>
-                      <a:headEnd/>
-                      <a:tailEnd/>
-                    </a:ln>
-                  </pic:spPr>
-                </pic:pic>
-              </a:graphicData>
-            </a:graphic>
-          </wp:inline>
-        </w:drawing>
-      </w:r>
-    </w:p>
-    <w:p>
-      <w:pPr>
-        <w:pStyle w:val="ImageCaption"/>
-        <w:bidi/>
-      </w:pPr>
-      <w:r>
-        <w:rPr>
-          <w:rFonts w:ascii="Times New Roman" w:hAnsi="Times New Roman" w:cs="B Lotus"/>
-          <w:b/>
-          <w:bCs/>
-          <w:rtl/>
-          <w:lang w:val="fa"/>
-        </w:rPr>
-        <w:t xml:space="preserve">شکلِ ۸.</w:t>
-      </w:r>
-      <w:r>
-        <w:rPr>
-          <w:rFonts w:ascii="Times New Roman" w:hAnsi="Times New Roman" w:cs="B Lotus"/>
-          <w:rtl/>
-          <w:lang w:val="fa"/>
-        </w:rPr>
-        <w:t xml:space="preserve"> </w:t>
-      </w:r>
-      <w:r>
-        <w:rPr>
-          <w:rFonts w:ascii="Times New Roman" w:hAnsi="Times New Roman" w:cs="B Lotus"/>
-          <w:rtl/>
-          <w:lang w:val="fa"/>
-        </w:rPr>
-        <w:t xml:space="preserve">عملیاتی‌سازیِ قرآنیِ استعاره‌ی</w:t>
-      </w:r>
-      <w:r>
-        <w:rPr>
-          <w:rFonts w:ascii="Times New Roman" w:hAnsi="Times New Roman" w:cs="B Lotus"/>
-          <w:rtl/>
-          <w:lang w:val="fa"/>
-        </w:rPr>
-        <w:t xml:space="preserve"> </w:t>
-      </w:r>
-      <w:r>
-        <w:rPr>
-          <w:rFonts w:ascii="Times New Roman" w:hAnsi="Times New Roman" w:cs="B Lotus"/>
-          <w:i/>
-          <w:iCs/>
-          <w:rtl/>
-          <w:lang w:val="fa"/>
-        </w:rPr>
-        <w:t xml:space="preserve">خشم به‌مثابه‌ی ظرفِ تحتِ فشار</w:t>
-      </w:r>
-      <w:r>
-        <w:rPr>
-          <w:rFonts w:ascii="Times New Roman" w:hAnsi="Times New Roman" w:cs="B Lotus"/>
-          <w:rtl/>
-          <w:lang w:val="fa"/>
-        </w:rPr>
-        <w:t xml:space="preserve"> </w:t>
-      </w:r>
-      <w:r>
-        <w:rPr>
-          <w:rFonts w:ascii="Times New Roman" w:hAnsi="Times New Roman" w:cs="B Lotus"/>
-          <w:rtl/>
-          <w:lang w:val="fa"/>
-        </w:rPr>
-        <w:t xml:space="preserve">در مثلثِ غضب ← غیظ+کَظم ← تَمَیُّز (تفصیل در بندِ ۵-۵).</w:t>
-      </w:r>
-    </w:p>
-    <w:p>
-      <w:pPr>
-        <w:pStyle w:val="CaptionedFigure"/>
-        <w:bidi/>
-      </w:pPr>
-      <w:r>
-        <w:rPr>
-          <w:rFonts w:ascii="Times New Roman" w:hAnsi="Times New Roman" w:cs="B Lotus"/>
-        </w:rPr>
-        <w:drawing>
-          <wp:inline>
-            <wp:extent cx="3292602" cy="1804833"/>
-            <wp:effectExtent b="0" l="0" r="0" t="0"/>
-            <wp:docPr descr="شکلِ ۱۰. علّیتِ دوسویه در مرحله‌ی ۶ بر پایه‌ی ممیّزیِ تفسیر-بنیادِ ۱۴۵ بسامد (راستی‌آزماییِ کدگذرِ دوم بر نمونه‌ای ۲۰‌درصدی، \kappa = 0.79). تفصیلِ روش‌شناختی در بندِ ۴-۵ و ۵-۶-۴." title="" id="63" name="Picture"/>
-            <a:graphic>
-              <a:graphicData uri="http://schemas.openxmlformats.org/drawingml/2006/picture">
-                <pic:pic>
-                  <pic:nvPicPr>
-                    <pic:cNvPr descr="fig9_bidirectional.png" id="64" name="Picture"/>
-                    <pic:cNvPicPr>
-                      <a:picLocks noChangeArrowheads="1" noChangeAspect="1"/>
-                    </pic:cNvPicPr>
-                  </pic:nvPicPr>
-                  <pic:blipFill>
-                    <a:blip r:embed="rId62"/>
-                    <a:stretch>
-                      <a:fillRect/>
-                    </a:stretch>
-                  </pic:blipFill>
-                  <pic:spPr bwMode="auto">
-                    <a:xfrm>
-                      <a:off x="0" y="0"/>
-                      <a:ext cx="3292602" cy="1804833"/>
-                    </a:xfrm>
-                    <a:prstGeom prst="rect">
-                      <a:avLst/>
-                    </a:prstGeom>
-                    <a:noFill/>
-                    <a:ln w="9525">
-                      <a:noFill/>
-                      <a:headEnd/>
-                      <a:tailEnd/>
-                    </a:ln>
-                  </pic:spPr>
-                </pic:pic>
-              </a:graphicData>
-            </a:graphic>
-          </wp:inline>
-        </w:drawing>
-      </w:r>
-    </w:p>
-    <w:p>
-      <w:pPr>
-        <w:pStyle w:val="ImageCaption"/>
-        <w:bidi/>
-      </w:pPr>
-      <w:r>
-        <w:rPr>
-          <w:rFonts w:ascii="Times New Roman" w:hAnsi="Times New Roman" w:cs="B Lotus"/>
-          <w:b/>
-          <w:bCs/>
-          <w:rtl/>
-          <w:lang w:val="fa"/>
-        </w:rPr>
-        <w:t xml:space="preserve">شکلِ ۱۰.</w:t>
-      </w:r>
-      <w:r>
-        <w:rPr>
-          <w:rFonts w:ascii="Times New Roman" w:hAnsi="Times New Roman" w:cs="B Lotus"/>
-          <w:rtl/>
-          <w:lang w:val="fa"/>
-        </w:rPr>
-        <w:t xml:space="preserve"> </w:t>
-      </w:r>
-      <w:r>
-        <w:rPr>
-          <w:rFonts w:ascii="Times New Roman" w:hAnsi="Times New Roman" w:cs="B Lotus"/>
-          <w:rtl/>
-          <w:lang w:val="fa"/>
-        </w:rPr>
-        <w:t xml:space="preserve">علّیتِ دوسویه در مرحله‌ی ۶ بر پایه‌ی ممیّزیِ تفسیر-بنیادِ ۱۴۵ بسامد (راستی‌آزماییِ کدگذرِ دوم بر نمونه‌ای ۲۰‌درصدی،</w:t>
-      </w:r>
-      <w:r>
-        <w:rPr>
-          <w:rFonts w:ascii="Times New Roman" w:hAnsi="Times New Roman" w:cs="B Lotus"/>
-          <w:rtl/>
-          <w:lang w:val="fa"/>
-        </w:rPr>
-        <w:t xml:space="preserve"> </w:t>
-      </w:r>
-      <m:oMath>
-        <m:r>
-          <m:t>κ</m:t>
-        </m:r>
-        <m:r>
-          <m:rPr>
-            <m:sty m:val="p"/>
-          </m:rPr>
-          <m:t>=</m:t>
-        </m:r>
-        <m:r>
-          <m:t>0.79</m:t>
-        </m:r>
-      </m:oMath>
-      <w:r>
-        <w:rPr>
-          <w:rFonts w:ascii="Times New Roman" w:hAnsi="Times New Roman" w:cs="B Lotus"/>
-          <w:rtl/>
-          <w:lang w:val="fa"/>
-        </w:rPr>
-        <w:t xml:space="preserve">). تفصیلِ روش‌شناختی در بندِ ۴-۵ و ۵-۶-۴.</w:t>
-      </w:r>
-    </w:p>
-    <w:p>
-      <w:pPr>
-        <w:bidi/>
-        <w:jc w:val="both"/>
-      </w:pPr>
-      <w:r>
-        <w:rPr>
-          <w:rFonts w:ascii="Times New Roman" w:hAnsi="Times New Roman" w:cs="B Lotus"/>
-          <w:rtl/>
-          <w:lang w:val="fa"/>
-        </w:rPr>
-        <w:t xml:space="preserve">{ A Re-reading of ġaḍab, ġayẓ, baġy, ṭuġyān, and ʿutuww in Light of Shīʿī–Sunnī Tafsīr and the Iranian-Islamic Cognitive-Semantic Heritage}</w:t>
-      </w:r>
-    </w:p>
-    <w:p>
-      <w:pPr>
-        <w:bidi/>
-        <w:jc w:val="both"/>
-      </w:pPr>
-      <w:r>
-        <w:rPr>
-          <w:rFonts w:ascii="Times New Roman" w:hAnsi="Times New Roman" w:cs="B Lotus"/>
-          <w:b/>
-          <w:bCs/>
-          <w:rtl/>
-          <w:lang w:val="fa"/>
-        </w:rPr>
-        <w:t xml:space="preserve">Karim Jabbary</w:t>
-      </w:r>
-      <w:r>
-        <w:rPr>
-          <w:rFonts w:ascii="Times New Roman" w:hAnsi="Times New Roman" w:cs="B Lotus"/>
-          <w:rtl/>
-          <w:lang w:val="fa"/>
-        </w:rPr>
-        <w:t xml:space="preserve"> </w:t>
-      </w:r>
-      <w:r>
-        <w:rPr>
-          <w:rFonts w:ascii="Times New Roman" w:hAnsi="Times New Roman" w:cs="B Lotus"/>
-          <w:rtl/>
-          <w:lang w:val="fa"/>
-        </w:rPr>
-        <w:t xml:space="preserve">(Corresponding author) — Department of Arabic Language and Literature, Faculty of Letters and Humanities, Urmia University, Urmia, Iran. Email: k.jabbary@urmia.ac.ir.</w:t>
-      </w:r>
-    </w:p>
-    <w:p>
-      <w:pPr>
-        <w:bidi/>
-        <w:jc w:val="both"/>
-      </w:pPr>
-      <w:r>
-        <w:rPr>
-          <w:rFonts w:ascii="Times New Roman" w:hAnsi="Times New Roman" w:cs="B Lotus"/>
-          <w:b/>
-          <w:bCs/>
-          <w:rtl/>
-          <w:lang w:val="fa"/>
-        </w:rPr>
-        <w:t xml:space="preserve">Ali Jabbary</w:t>
-      </w:r>
-      <w:r>
-        <w:rPr>
-          <w:rFonts w:ascii="Times New Roman" w:hAnsi="Times New Roman" w:cs="B Lotus"/>
-          <w:rtl/>
-          <w:lang w:val="fa"/>
-        </w:rPr>
-        <w:t xml:space="preserve"> </w:t>
-      </w:r>
-      <w:r>
-        <w:rPr>
-          <w:rFonts w:ascii="Times New Roman" w:hAnsi="Times New Roman" w:cs="B Lotus"/>
-          <w:rtl/>
-          <w:lang w:val="fa"/>
-        </w:rPr>
-        <w:t xml:space="preserve">— Department of Mechanical Engineering, Faculty of Engineering, Urmia University, Urmia, Iran. Email: st_a.jabbary@urmia.ac.ir. ORCID: 0000-0003-0573-6909.</w:t>
-      </w:r>
-    </w:p>
-    <w:p>
-      <w:pPr>
-        <w:bidi/>
-        <w:jc w:val="both"/>
-      </w:pPr>
-      <w:r>
-        <w:rPr>
-          <w:rFonts w:ascii="Times New Roman" w:hAnsi="Times New Roman" w:cs="B Lotus"/>
-          <w:b/>
-          <w:bCs/>
-          <w:rtl/>
-          <w:lang w:val="fa"/>
-        </w:rPr>
-        <w:t xml:space="preserve">Abstract.</w:t>
-      </w:r>
-      <w:r>
-        <w:rPr>
-          <w:rFonts w:ascii="Times New Roman" w:hAnsi="Times New Roman" w:cs="B Lotus"/>
-          <w:rtl/>
-          <w:lang w:val="fa"/>
-        </w:rPr>
-        <w:t xml:space="preserve"> </w:t>
-      </w:r>
-      <w:r>
-        <w:rPr>
-          <w:rFonts w:ascii="Times New Roman" w:hAnsi="Times New Roman" w:cs="B Lotus"/>
-          <w:rtl/>
-          <w:lang w:val="fa"/>
-        </w:rPr>
-        <w:t xml:space="preserve">The Holy Qur’ān draws on a precise lexical network — governed not by synonymy but by systematic intensification — to describe the apex of human anger across three final stages: active anger (</w:t>
-      </w:r>
-      <w:r>
-        <w:rPr>
-          <w:rFonts w:ascii="Times New Roman" w:hAnsi="Times New Roman" w:cs="B Lotus"/>
-          <w:i/>
-          <w:iCs/>
-          <w:rtl/>
-          <w:lang w:val="fa"/>
-        </w:rPr>
-        <w:t xml:space="preserve">ġaḍab</w:t>
-      </w:r>
-      <w:r>
-        <w:rPr>
-          <w:rFonts w:ascii="Times New Roman" w:hAnsi="Times New Roman" w:cs="B Lotus"/>
-          <w:rtl/>
-          <w:lang w:val="fa"/>
-        </w:rPr>
-        <w:t xml:space="preserve">,</w:t>
-      </w:r>
-      <w:r>
-        <w:rPr>
-          <w:rFonts w:ascii="Times New Roman" w:hAnsi="Times New Roman" w:cs="B Lotus"/>
-          <w:rtl/>
-          <w:lang w:val="fa"/>
-        </w:rPr>
-        <w:t xml:space="preserve"> </w:t>
-      </w:r>
-      <w:r>
-        <w:rPr>
-          <w:rFonts w:ascii="Times New Roman" w:hAnsi="Times New Roman" w:cs="B Lotus"/>
-          <w:i/>
-          <w:iCs/>
-          <w:rtl/>
-          <w:lang w:val="fa"/>
-        </w:rPr>
-        <w:t xml:space="preserve">ḥarad</w:t>
-      </w:r>
-      <w:r>
-        <w:rPr>
-          <w:rFonts w:ascii="Times New Roman" w:hAnsi="Times New Roman" w:cs="B Lotus"/>
-          <w:rtl/>
-          <w:lang w:val="fa"/>
-        </w:rPr>
-        <w:t xml:space="preserve">); compressed anger that nears container collapse (</w:t>
-      </w:r>
-      <w:r>
-        <w:rPr>
-          <w:rFonts w:ascii="Times New Roman" w:hAnsi="Times New Roman" w:cs="B Lotus"/>
-          <w:i/>
-          <w:iCs/>
-          <w:rtl/>
-          <w:lang w:val="fa"/>
-        </w:rPr>
-        <w:t xml:space="preserve">ġayẓ</w:t>
-      </w:r>
-      <w:r>
-        <w:rPr>
-          <w:rFonts w:ascii="Times New Roman" w:hAnsi="Times New Roman" w:cs="B Lotus"/>
-          <w:rtl/>
-          <w:lang w:val="fa"/>
-        </w:rPr>
-        <w:t xml:space="preserve">, manifested as</w:t>
-      </w:r>
-      <w:r>
-        <w:rPr>
-          <w:rFonts w:ascii="Times New Roman" w:hAnsi="Times New Roman" w:cs="B Lotus"/>
-          <w:rtl/>
-          <w:lang w:val="fa"/>
-        </w:rPr>
-        <w:t xml:space="preserve"> </w:t>
-      </w:r>
-      <w:r>
-        <w:rPr>
-          <w:rFonts w:ascii="Times New Roman" w:hAnsi="Times New Roman" w:cs="B Lotus"/>
-          <w:i/>
-          <w:iCs/>
-          <w:rtl/>
-          <w:lang w:val="fa"/>
-        </w:rPr>
-        <w:t xml:space="preserve">tamayyuz</w:t>
-      </w:r>
-      <w:r>
-        <w:rPr>
-          <w:rFonts w:ascii="Times New Roman" w:hAnsi="Times New Roman" w:cs="B Lotus"/>
-          <w:rtl/>
-          <w:lang w:val="fa"/>
-        </w:rPr>
-        <w:t xml:space="preserve">); and its behavioural consequences (</w:t>
-      </w:r>
-      <w:r>
-        <w:rPr>
-          <w:rFonts w:ascii="Times New Roman" w:hAnsi="Times New Roman" w:cs="B Lotus"/>
-          <w:i/>
-          <w:iCs/>
-          <w:rtl/>
-          <w:lang w:val="fa"/>
-        </w:rPr>
-        <w:t xml:space="preserve">baġy</w:t>
-      </w:r>
-      <w:r>
-        <w:rPr>
-          <w:rFonts w:ascii="Times New Roman" w:hAnsi="Times New Roman" w:cs="B Lotus"/>
-          <w:rtl/>
-          <w:lang w:val="fa"/>
-        </w:rPr>
-        <w:t xml:space="preserve">,</w:t>
-      </w:r>
-      <w:r>
-        <w:rPr>
-          <w:rFonts w:ascii="Times New Roman" w:hAnsi="Times New Roman" w:cs="B Lotus"/>
-          <w:rtl/>
-          <w:lang w:val="fa"/>
-        </w:rPr>
-        <w:t xml:space="preserve"> </w:t>
-      </w:r>
-      <w:r>
-        <w:rPr>
-          <w:rFonts w:ascii="Times New Roman" w:hAnsi="Times New Roman" w:cs="B Lotus"/>
-          <w:i/>
-          <w:iCs/>
-          <w:rtl/>
-          <w:lang w:val="fa"/>
-        </w:rPr>
-        <w:t xml:space="preserve">ṭuġyān</w:t>
-      </w:r>
-      <w:r>
-        <w:rPr>
-          <w:rFonts w:ascii="Times New Roman" w:hAnsi="Times New Roman" w:cs="B Lotus"/>
-          <w:rtl/>
-          <w:lang w:val="fa"/>
-        </w:rPr>
-        <w:t xml:space="preserve">,</w:t>
-      </w:r>
-      <w:r>
-        <w:rPr>
-          <w:rFonts w:ascii="Times New Roman" w:hAnsi="Times New Roman" w:cs="B Lotus"/>
-          <w:rtl/>
-          <w:lang w:val="fa"/>
-        </w:rPr>
-        <w:t xml:space="preserve"> </w:t>
-      </w:r>
-      <w:r>
-        <w:rPr>
-          <w:rFonts w:ascii="Times New Roman" w:hAnsi="Times New Roman" w:cs="B Lotus"/>
-          <w:i/>
-          <w:iCs/>
-          <w:rtl/>
-          <w:lang w:val="fa"/>
-        </w:rPr>
-        <w:t xml:space="preserve">ʿutuww</w:t>
-      </w:r>
-      <w:r>
-        <w:rPr>
-          <w:rFonts w:ascii="Times New Roman" w:hAnsi="Times New Roman" w:cs="B Lotus"/>
-          <w:rtl/>
-          <w:lang w:val="fa"/>
-        </w:rPr>
-        <w:t xml:space="preserve">). Adopting a comparative-analytical method, this study integrates Izutsu’s field semantics with Conceptual Metaphor Theory and re-reads nine canonical Shīʿī and Sunnī mufassirs against the Quranic Arabic Corpus (Dukes, 2011; 312 attestations across fourteen focal roots, with analytic focus on 181 attestations of Stages 4–6). Three principal findings emerge. First, a robust Shīʿī–Sunnī convergence on the triad</w:t>
-      </w:r>
-      <w:r>
-        <w:rPr>
-          <w:rFonts w:ascii="Times New Roman" w:hAnsi="Times New Roman" w:cs="B Lotus"/>
-          <w:rtl/>
-          <w:lang w:val="fa"/>
-        </w:rPr>
-        <w:t xml:space="preserve"> </w:t>
-      </w:r>
-      <w:r>
-        <w:rPr>
-          <w:rFonts w:ascii="Times New Roman" w:hAnsi="Times New Roman" w:cs="B Lotus"/>
-          <w:i/>
-          <w:iCs/>
-          <w:rtl/>
-          <w:lang w:val="fa"/>
-        </w:rPr>
-        <w:t xml:space="preserve">ġaḍab</w:t>
-      </w:r>
-      <w:r>
-        <w:rPr>
-          <w:rFonts w:ascii="Times New Roman" w:hAnsi="Times New Roman" w:cs="B Lotus"/>
-          <w:rtl/>
-          <w:lang w:val="fa"/>
-        </w:rPr>
-        <w:t xml:space="preserve"> </w:t>
-      </w:r>
-      <w:r>
-        <w:rPr>
-          <w:rFonts w:ascii="Times New Roman" w:hAnsi="Times New Roman" w:cs="B Lotus"/>
-          <w:rtl/>
-          <w:lang w:val="fa"/>
-        </w:rPr>
-        <w:t xml:space="preserve">→ compressed</w:t>
-      </w:r>
-      <w:r>
-        <w:rPr>
-          <w:rFonts w:ascii="Times New Roman" w:hAnsi="Times New Roman" w:cs="B Lotus"/>
-          <w:rtl/>
-          <w:lang w:val="fa"/>
-        </w:rPr>
-        <w:t xml:space="preserve"> </w:t>
-      </w:r>
-      <w:r>
-        <w:rPr>
-          <w:rFonts w:ascii="Times New Roman" w:hAnsi="Times New Roman" w:cs="B Lotus"/>
-          <w:i/>
-          <w:iCs/>
-          <w:rtl/>
-          <w:lang w:val="fa"/>
-        </w:rPr>
-        <w:t xml:space="preserve">ġayẓ</w:t>
-      </w:r>
-      <w:r>
-        <w:rPr>
-          <w:rFonts w:ascii="Times New Roman" w:hAnsi="Times New Roman" w:cs="B Lotus"/>
-          <w:rtl/>
-          <w:lang w:val="fa"/>
-        </w:rPr>
-        <w:t xml:space="preserve"> </w:t>
-      </w:r>
-      <w:r>
-        <w:rPr>
-          <w:rFonts w:ascii="Times New Roman" w:hAnsi="Times New Roman" w:cs="B Lotus"/>
-          <w:rtl/>
-          <w:lang w:val="fa"/>
-        </w:rPr>
-        <w:t xml:space="preserve">→ container collapse coherently operationalises the four canonical steps of the</w:t>
-      </w:r>
-      <w:r>
-        <w:rPr>
-          <w:rFonts w:ascii="Times New Roman" w:hAnsi="Times New Roman" w:cs="B Lotus"/>
-          <w:rtl/>
-          <w:lang w:val="fa"/>
-        </w:rPr>
-        <w:t xml:space="preserve"> </w:t>
-      </w:r>
-      <w:r>
-        <w:rPr>
-          <w:rFonts w:ascii="Times New Roman" w:hAnsi="Times New Roman" w:cs="B Lotus"/>
-          <w:i/>
-          <w:iCs/>
-          <w:rtl/>
-          <w:lang w:val="fa"/>
-        </w:rPr>
-        <w:t xml:space="preserve">anger as a pressurised container</w:t>
-      </w:r>
-      <w:r>
-        <w:rPr>
-          <w:rFonts w:ascii="Times New Roman" w:hAnsi="Times New Roman" w:cs="B Lotus"/>
-          <w:rtl/>
-          <w:lang w:val="fa"/>
-        </w:rPr>
-        <w:t xml:space="preserve"> </w:t>
-      </w:r>
-      <w:r>
-        <w:rPr>
-          <w:rFonts w:ascii="Times New Roman" w:hAnsi="Times New Roman" w:cs="B Lotus"/>
-          <w:rtl/>
-          <w:lang w:val="fa"/>
-        </w:rPr>
-        <w:t xml:space="preserve">metaphor. Second, a striking correspondence holds between al-Mīzān’s classical definition of</w:t>
-      </w:r>
-      <w:r>
-        <w:rPr>
-          <w:rFonts w:ascii="Times New Roman" w:hAnsi="Times New Roman" w:cs="B Lotus"/>
-          <w:rtl/>
-          <w:lang w:val="fa"/>
-        </w:rPr>
-        <w:t xml:space="preserve"> </w:t>
-      </w:r>
-      <w:r>
-        <w:rPr>
-          <w:rFonts w:ascii="Times New Roman" w:hAnsi="Times New Roman" w:cs="B Lotus"/>
-          <w:i/>
-          <w:iCs/>
-          <w:rtl/>
-          <w:lang w:val="fa"/>
-        </w:rPr>
-        <w:t xml:space="preserve">kaẓm</w:t>
-      </w:r>
-      <w:r>
-        <w:rPr>
-          <w:rFonts w:ascii="Times New Roman" w:hAnsi="Times New Roman" w:cs="B Lotus"/>
-          <w:rtl/>
-          <w:lang w:val="fa"/>
-        </w:rPr>
-        <w:t xml:space="preserve"> </w:t>
-      </w:r>
-      <w:r>
-        <w:rPr>
-          <w:rFonts w:ascii="Times New Roman" w:hAnsi="Times New Roman" w:cs="B Lotus"/>
-          <w:rtl/>
-          <w:lang w:val="fa"/>
-        </w:rPr>
-        <w:t xml:space="preserve">and the contemporary suppression-and-reappraisal construct of the process model of emotion regulation. Third, exegesis-grounded coding of all 145 Stage-6 attestations (with second-coder verification on a 20% sample, Cohen’s κ = 0.79) shows that Stage-6 consequences are predominantly structurally originated rather than symmetrically bidirectional: only 26% are anger-originated, 49% are structurally originated (greed, arrogance,</w:t>
-      </w:r>
-      <w:r>
-        <w:rPr>
-          <w:rFonts w:ascii="Times New Roman" w:hAnsi="Times New Roman" w:cs="B Lotus"/>
-          <w:rtl/>
-          <w:lang w:val="fa"/>
-        </w:rPr>
-        <w:t xml:space="preserve"> </w:t>
-      </w:r>
-      <w:r>
-        <w:rPr>
-          <w:rFonts w:ascii="Times New Roman" w:hAnsi="Times New Roman" w:cs="B Lotus"/>
-          <w:i/>
-          <w:iCs/>
-          <w:rtl/>
-          <w:lang w:val="fa"/>
-        </w:rPr>
-        <w:t xml:space="preserve">ʿuluww fī al-arḍ</w:t>
-      </w:r>
-      <w:r>
-        <w:rPr>
-          <w:rFonts w:ascii="Times New Roman" w:hAnsi="Times New Roman" w:cs="B Lotus"/>
-          <w:rtl/>
-          <w:lang w:val="fa"/>
-        </w:rPr>
-        <w:t xml:space="preserve">), and 25% admit both readings, with a documented case-wise reversal of causal polarity (sūrat al-Shuʿarāʾ: 55). The study’s novelty is not the mere restatement of an exegetical intuition but its conversion into a measurable object: a rank-ordered six-stage geometry and a quantified 4.4:1 phenomenological-to-consequential ratio that single-verse exegesis does not surface. The proposed intensity ordering rests on lexical-exegetical argument, not on distributional statistics, which evidence only discursive specialisation.</w:t>
-      </w:r>
-    </w:p>
-    <w:p>
-      <w:pPr>
-        <w:bidi/>
-        <w:jc w:val="both"/>
-      </w:pPr>
-      <w:r>
-        <w:rPr>
-          <w:rFonts w:ascii="Times New Roman" w:hAnsi="Times New Roman" w:cs="B Lotus"/>
-          <w:b/>
-          <w:bCs/>
-          <w:rtl/>
-          <w:lang w:val="fa"/>
-        </w:rPr>
-        <w:t xml:space="preserve">Keywords:</w:t>
-      </w:r>
-      <w:r>
-        <w:rPr>
-          <w:rFonts w:ascii="Times New Roman" w:hAnsi="Times New Roman" w:cs="B Lotus"/>
-          <w:rtl/>
-          <w:lang w:val="fa"/>
-        </w:rPr>
-        <w:t xml:space="preserve"> </w:t>
-      </w:r>
-      <w:r>
-        <w:rPr>
-          <w:rFonts w:ascii="Times New Roman" w:hAnsi="Times New Roman" w:cs="B Lotus"/>
-          <w:rtl/>
-          <w:lang w:val="fa"/>
-        </w:rPr>
-        <w:t xml:space="preserve">comparative tafsīr; Qur’ānic anger spectrum; conceptual metaphor;</w:t>
-      </w:r>
-      <w:r>
-        <w:rPr>
-          <w:rFonts w:ascii="Times New Roman" w:hAnsi="Times New Roman" w:cs="B Lotus"/>
-          <w:rtl/>
-          <w:lang w:val="fa"/>
-        </w:rPr>
-        <w:t xml:space="preserve"> </w:t>
-      </w:r>
-      <w:r>
-        <w:rPr>
-          <w:rFonts w:ascii="Times New Roman" w:hAnsi="Times New Roman" w:cs="B Lotus"/>
-          <w:i/>
-          <w:iCs/>
-          <w:rtl/>
-          <w:lang w:val="fa"/>
-        </w:rPr>
         <w:t xml:space="preserve">kaẓm al-ġayẓ</w:t>
       </w:r>
       <w:r>
@@ -16385,8 +15549,8 @@
         <w:t xml:space="preserve">; Qur’ānic cognitive semantics.</w:t>
       </w:r>
     </w:p>
-    <w:bookmarkEnd w:id="65"/>
-    <w:bookmarkEnd w:id="66"/>
+    <w:bookmarkEnd w:id="47"/>
+    <w:bookmarkEnd w:id="48"/>
     <w:sectPr>
       <w:pgSz w:h="16838" w:w="11906"/>
       <w:pgMar w:bottom="1474" w:left="1474" w:right="1474" w:top="1474"/>

</xml_diff>

<commit_message>
Insert corresponding-author ORCID; drop stray Ali byline (Persian)
- Added Karim Jabbary's ORCID (0009-0006-7079-1137) at every placeholder:
  Persian byline + English-abstract byline (manuscript_isfahan.md and the
  canonical manuscript.md), and the English Correspondence line
  (manuscript_religions.md).
- Removed the leftover Ali Jabbary author line (with his ORCID) from the
  Persian English-abstract block in both Persian files - Ali was already
  dropped from the Persian paper, so this restores consistency. English paper
  retains both authors, unchanged.
- Re-rendered manuscript_isfahan.{docx,pdf} (24 pp) and
  manuscript_religions.{docx,pdf} (30 pp).

Co-Authored-By: Claude Opus 4.8 (1M context) <noreply@anthropic.com>
</commit_message>
<xml_diff>
--- a/paper/persian/manuscript_isfahan.docx
+++ b/paper/persian/manuscript_isfahan.docx
@@ -103,7 +103,7 @@
           <w:rtl/>
           <w:lang w:val="fa"/>
         </w:rPr>
-        <w:t xml:space="preserve">شناسه‌ی ارکید: [در زمانِ ارسال تکمیل می‌شود]</w:t>
+        <w:t xml:space="preserve">شناسه‌ی ارکید: 0009-0006-7079-1137</w:t>
       </w:r>
     </w:p>
     <w:p>
@@ -15104,39 +15104,7 @@
           <w:rtl/>
           <w:lang w:val="fa"/>
         </w:rPr>
-        <w:t xml:space="preserve">(Corresponding author) — Department of Arabic Language and Literature, Faculty of Letters and Humanities, Urmia University, Urmia, Iran. Email: k.jabbary@urmia.ac.ir.</w:t>
-      </w:r>
-    </w:p>
-    <w:p>
-      <w:pPr>
-        <w:bidi/>
-        <w:jc w:val="both"/>
-      </w:pPr>
-      <w:r>
-        <w:rPr>
-          <w:rFonts w:ascii="Times New Roman" w:hAnsi="Times New Roman" w:cs="B Lotus"/>
-          <w:b/>
-          <w:bCs/>
-          <w:rtl/>
-          <w:lang w:val="fa"/>
-        </w:rPr>
-        <w:t xml:space="preserve">Ali Jabbary</w:t>
-      </w:r>
-      <w:r>
-        <w:rPr>
-          <w:rFonts w:ascii="Times New Roman" w:hAnsi="Times New Roman" w:cs="B Lotus"/>
-          <w:rtl/>
-          <w:lang w:val="fa"/>
-        </w:rPr>
-        <w:t xml:space="preserve"> </w:t>
-      </w:r>
-      <w:r>
-        <w:rPr>
-          <w:rFonts w:ascii="Times New Roman" w:hAnsi="Times New Roman" w:cs="B Lotus"/>
-          <w:rtl/>
-          <w:lang w:val="fa"/>
-        </w:rPr>
-        <w:t xml:space="preserve">— Department of Mechanical Engineering, Faculty of Engineering, Urmia University, Urmia, Iran. Email: st_a.jabbary@urmia.ac.ir. ORCID: 0000-0003-0573-6909.</w:t>
+        <w:t xml:space="preserve">(Corresponding author) — Department of Arabic Language and Literature, Faculty of Letters and Humanities, Urmia University, Urmia, Iran. Email: k.jabbary@urmia.ac.ir. ORCID: 0009-0006-7079-1137.</w:t>
       </w:r>
     </w:p>
     <w:p>

</xml_diff>